<commit_message>
03-16-2026: correction to 1.2 assignment
</commit_message>
<xml_diff>
--- a/module-1/nizam-1_2-assignment.docx
+++ b/module-1/nizam-1_2-assignment.docx
@@ -21,7 +21,7 @@
         <w:t xml:space="preserve"> – </w:t>
       </w:r>
       <w:r>
-        <w:t>Database Development &amp; Use</w:t>
+        <w:t>Web Development with HTML and CSS</w:t>
       </w:r>
     </w:p>
     <w:p>
@@ -39,6 +39,9 @@
     </w:p>
     <w:p>
       <w:r>
+        <w:rPr>
+          <w:noProof/>
+        </w:rPr>
         <w:drawing>
           <wp:inline distT="0" distB="0" distL="0" distR="0" wp14:anchorId="7712B7BF" wp14:editId="5F7FD024">
             <wp:extent cx="5848350" cy="2924175"/>
@@ -78,6 +81,9 @@
     </w:p>
     <w:p>
       <w:r>
+        <w:rPr>
+          <w:noProof/>
+        </w:rPr>
         <w:drawing>
           <wp:inline distT="0" distB="0" distL="0" distR="0" wp14:anchorId="133350E2" wp14:editId="5E452F58">
             <wp:extent cx="5753100" cy="4122440"/>
@@ -728,7 +734,6 @@
   <w:style w:type="character" w:default="1" w:styleId="DefaultParagraphFont">
     <w:name w:val="Default Paragraph Font"/>
     <w:uiPriority w:val="1"/>
-    <w:semiHidden/>
     <w:unhideWhenUsed/>
   </w:style>
   <w:style w:type="table" w:default="1" w:styleId="TableNormal">

</xml_diff>